<commit_message>
Update default template to remove red X formatting
Fixes red text and oversized font in a specific cell of the Section G template document.

Replit-Commit-Author: Agent
Replit-Commit-Session-Id: cfc32c38-b2cd-42f6-93c7-c9cc7b36b658
Replit-Commit-Checkpoint-Type: full_checkpoint
Replit-Commit-Event-Id: 85d78e6a-7632-4fdb-a90a-8ee6d3ccc390
Replit-Commit-Screenshot-Url: https://storage.googleapis.com/screenshot-production-us-central1/af2874c8-850c-400e-9904-a383accec6ca/cfc32c38-b2cd-42f6-93c7-c9cc7b36b658/x8IPsKj
Replit-Helium-Checkpoint-Created: true
</commit_message>
<xml_diff>
--- a/attached_assets/330_Section_G_Standards_08-2026-mwc_1770486074175.docx
+++ b/attached_assets/330_Section_G_Standards_08-2026-mwc_1770486074175.docx
@@ -714,8 +714,8 @@
             <w:r>
               <w:rPr>
                 <w:rFonts w:ascii="Broadway" w:hAnsi="Broadway"/>
-                <w:color w:val="EE0000"/>
-                <w:sz w:val="24"/>
+                <w:color w:val="000000"/>
+                <w:sz w:val="16"/>
                 <w:szCs w:val="24"/>
               </w:rPr>
               <w:t>{{EMPLOYEE_PROJECT_1_1}}</w:t>

</xml_diff>